<commit_message>
docs(laporan bulan-4): tambah bukti kerja Data Engineer 2 dan ERD
Laporan Data Engineer 2 sebelumnya hanya punya satu tangkapan layar,
sehingga hasil integrasi September kurang terlihat. Bagian bukti kini
memuat dua diagram relasi data (venue/akomodasi ke dimensi wilayah;
statistik resmi ke dimensi periode/wilayah beserta kolom audit) dan
enam tangkapan dataset di dispar.rantai.dev dengan grafik bawaan
disembunyikan agar tabel dan keterangan sumber terbaca.

ERD diturunkan dari DESCRIBE TABLE silver.* di ClickHouse (9 Okt 2026);
jumlah baris bronze_sec = silver untuk ketujuh tabel, dan pencocokan
wilayah 100% kecuali asosiasi pariwisata (8/26). Hanya laporan 05 yang
dibangun ulang; laporan lain tidak berubah.
</commit_message>
<xml_diff>
--- a/report/tenaga-ahli/bulan-4/05-Data-Engineer-2.docx
+++ b/report/tenaga-ahli/bulan-4/05-Data-Engineer-2.docx
@@ -903,7 +903,7 @@
           <w:color w:val="1A1A1A"/>
           <w:sz w:val="22"/>
         </w:rPr>
-        <w:t>Riwayat jumlah baris dan hasil gerbang mutu menyediakan bukti periode September. Tangkapan layar menunjukkan dataset sekunder yang dapat dibuka saat verifikasi.</w:t>
+        <w:t>Riwayat jumlah baris dan hasil gerbang mutu menyediakan bukti periode September. Diagram struktur data disusun dari definisi kolom tampilan data bersih pada gudang data, sedangkan tangkapan layar menunjukkan dataset hasil integrasi yang dapat dibuka di aplikasi saat pemeriksaan 9 Oktober 2026. Pada tangkapan layar, grafik bawaan halaman disembunyikan agar judul, keterangan sumber, lapisan pengolahan, dan tabel data terbaca utuh.</w:t>
       </w:r>
     </w:p>
     <w:p>
@@ -1711,7 +1711,7 @@
       <w:r>
         <w:drawing>
           <wp:inline xmlns:a="http://schemas.openxmlformats.org/drawingml/2006/main" xmlns:pic="http://schemas.openxmlformats.org/drawingml/2006/picture">
-            <wp:extent cx="5580000" cy="3875000"/>
+            <wp:extent cx="5580000" cy="2934803"/>
             <wp:docPr id="1" name="Picture 1"/>
             <wp:cNvGraphicFramePr>
               <a:graphicFrameLocks noChangeAspect="1"/>
@@ -1720,11 +1720,123 @@
               <a:graphicData uri="http://schemas.openxmlformats.org/drawingml/2006/picture">
                 <pic:pic>
                   <pic:nvPicPr>
-                    <pic:cNvPr id="0" name="07-wellness.jpg"/>
+                    <pic:cNvPr id="0" name="12-erd-venue-akomodasi.jpg"/>
                     <pic:cNvPicPr/>
                   </pic:nvPicPr>
                   <pic:blipFill>
                     <a:blip r:embed="rId9"/>
+                    <a:stretch>
+                      <a:fillRect/>
+                    </a:stretch>
+                  </pic:blipFill>
+                  <pic:spPr>
+                    <a:xfrm>
+                      <a:off x="0" y="0"/>
+                      <a:ext cx="5580000" cy="2934803"/>
+                    </a:xfrm>
+                    <a:prstGeom prst="rect"/>
+                  </pic:spPr>
+                </pic:pic>
+              </a:graphicData>
+            </a:graphic>
+          </wp:inline>
+        </w:drawing>
+      </w:r>
+    </w:p>
+    <w:p>
+      <w:pPr>
+        <w:spacing w:after="200"/>
+        <w:jc w:val="center"/>
+      </w:pPr>
+      <w:r>
+        <w:rPr>
+          <w:rFonts w:ascii="Arial" w:hAnsi="Arial"/>
+          <w:i/>
+          <w:color w:val="555555"/>
+          <w:sz w:val="18"/>
+        </w:rPr>
+        <w:t>Gambar 1. Diagram relasi data venue dan akomodasi: lima tabel bersih (kamar hotel 484 baris, hotel transit 43, desa wisata 48, usaha wellness 84, asosiasi pariwisata 26) dicocokkan ke dimensi wilayah bersama. Sumber: DESCRIBE TABLE silver.* pada ClickHouse; diagram disusun 9 Oktober 2026.</w:t>
+      </w:r>
+    </w:p>
+    <w:p>
+      <w:pPr>
+        <w:keepNext/>
+        <w:spacing w:before="120" w:after="40"/>
+        <w:jc w:val="center"/>
+      </w:pPr>
+      <w:r>
+        <w:drawing>
+          <wp:inline xmlns:a="http://schemas.openxmlformats.org/drawingml/2006/main" xmlns:pic="http://schemas.openxmlformats.org/drawingml/2006/picture">
+            <wp:extent cx="5580000" cy="2118265"/>
+            <wp:docPr id="2" name="Picture 2"/>
+            <wp:cNvGraphicFramePr>
+              <a:graphicFrameLocks noChangeAspect="1"/>
+            </wp:cNvGraphicFramePr>
+            <a:graphic>
+              <a:graphicData uri="http://schemas.openxmlformats.org/drawingml/2006/picture">
+                <pic:pic>
+                  <pic:nvPicPr>
+                    <pic:cNvPr id="0" name="13-erd-statistik-audit.jpg"/>
+                    <pic:cNvPicPr/>
+                  </pic:nvPicPr>
+                  <pic:blipFill>
+                    <a:blip r:embed="rId10"/>
+                    <a:stretch>
+                      <a:fillRect/>
+                    </a:stretch>
+                  </pic:blipFill>
+                  <pic:spPr>
+                    <a:xfrm>
+                      <a:off x="0" y="0"/>
+                      <a:ext cx="5580000" cy="2118265"/>
+                    </a:xfrm>
+                    <a:prstGeom prst="rect"/>
+                  </pic:spPr>
+                </pic:pic>
+              </a:graphicData>
+            </a:graphic>
+          </wp:inline>
+        </w:drawing>
+      </w:r>
+    </w:p>
+    <w:p>
+      <w:pPr>
+        <w:spacing w:after="200"/>
+        <w:jc w:val="center"/>
+      </w:pPr>
+      <w:r>
+        <w:rPr>
+          <w:rFonts w:ascii="Arial" w:hAnsi="Arial"/>
+          <w:i/>
+          <w:color w:val="555555"/>
+          <w:sz w:val="18"/>
+        </w:rPr>
+        <w:t>Gambar 2. Diagram relasi data statistik resmi (perjalanan wisnus 534 baris, tenaga kerja ekonomi kreatif 522 baris) ke dimensi periode dan wilayah, beserta kolom audit yang diwarisi dari lapisan data mentah. Sumber: DESCRIBE TABLE silver.* pada ClickHouse; diagram disusun 9 Oktober 2026.</w:t>
+      </w:r>
+    </w:p>
+    <w:p>
+      <w:pPr>
+        <w:keepNext/>
+        <w:spacing w:before="120" w:after="40"/>
+        <w:jc w:val="center"/>
+      </w:pPr>
+      <w:r>
+        <w:drawing>
+          <wp:inline xmlns:a="http://schemas.openxmlformats.org/drawingml/2006/main" xmlns:pic="http://schemas.openxmlformats.org/drawingml/2006/picture">
+            <wp:extent cx="5580000" cy="3875000"/>
+            <wp:docPr id="3" name="Picture 3"/>
+            <wp:cNvGraphicFramePr>
+              <a:graphicFrameLocks noChangeAspect="1"/>
+            </wp:cNvGraphicFramePr>
+            <a:graphic>
+              <a:graphicData uri="http://schemas.openxmlformats.org/drawingml/2006/picture">
+                <pic:pic>
+                  <pic:nvPicPr>
+                    <pic:cNvPr id="0" name="14-data-wisnus-kota.jpg"/>
+                    <pic:cNvPicPr/>
+                  </pic:nvPicPr>
+                  <pic:blipFill>
+                    <a:blip r:embed="rId11"/>
                     <a:stretch>
                       <a:fillRect/>
                     </a:stretch>
@@ -1755,7 +1867,287 @@
           <w:color w:val="555555"/>
           <w:sz w:val="18"/>
         </w:rPr>
-        <w:t>Gambar 1. Dataset venue wellness dengan keterangan asal dan metode pengumpulan. Sumber: https://dispar.rantai.dev/sdi/wellness-jakarta; tangkapan layar 2 Oktober 2026.</w:t>
+        <w:t>Gambar 3. Dataset perjalanan wisnus menurut kota tujuan (BPS) setelah melewati lapisan mentah ke tampilan data bersih. Sumber: https://dispar.rantai.dev/sdi/wisnus-perjalanan-per-kota-tujuan; tangkapan layar 9 Oktober 2026.</w:t>
+      </w:r>
+    </w:p>
+    <w:p>
+      <w:pPr>
+        <w:keepNext/>
+        <w:spacing w:before="120" w:after="40"/>
+        <w:jc w:val="center"/>
+      </w:pPr>
+      <w:r>
+        <w:drawing>
+          <wp:inline xmlns:a="http://schemas.openxmlformats.org/drawingml/2006/main" xmlns:pic="http://schemas.openxmlformats.org/drawingml/2006/picture">
+            <wp:extent cx="5580000" cy="3875000"/>
+            <wp:docPr id="4" name="Picture 4"/>
+            <wp:cNvGraphicFramePr>
+              <a:graphicFrameLocks noChangeAspect="1"/>
+            </wp:cNvGraphicFramePr>
+            <a:graphic>
+              <a:graphicData uri="http://schemas.openxmlformats.org/drawingml/2006/picture">
+                <pic:pic>
+                  <pic:nvPicPr>
+                    <pic:cNvPr id="0" name="15-data-tenaga-kerja.jpg"/>
+                    <pic:cNvPicPr/>
+                  </pic:nvPicPr>
+                  <pic:blipFill>
+                    <a:blip r:embed="rId12"/>
+                    <a:stretch>
+                      <a:fillRect/>
+                    </a:stretch>
+                  </pic:blipFill>
+                  <pic:spPr>
+                    <a:xfrm>
+                      <a:off x="0" y="0"/>
+                      <a:ext cx="5580000" cy="3875000"/>
+                    </a:xfrm>
+                    <a:prstGeom prst="rect"/>
+                  </pic:spPr>
+                </pic:pic>
+              </a:graphicData>
+            </a:graphic>
+          </wp:inline>
+        </w:drawing>
+      </w:r>
+    </w:p>
+    <w:p>
+      <w:pPr>
+        <w:spacing w:after="200"/>
+        <w:jc w:val="center"/>
+      </w:pPr>
+      <w:r>
+        <w:rPr>
+          <w:rFonts w:ascii="Arial" w:hAnsi="Arial"/>
+          <w:i/>
+          <w:color w:val="555555"/>
+          <w:sz w:val="18"/>
+        </w:rPr>
+        <w:t>Gambar 4. Dataset tenaga kerja ekonomi kreatif per provinsi dan jenis kelamin dari Satu Data Ekraf, dengan tautan sumber resmi. Sumber: https://dispar.rantai.dev/sdi/tenaga-kerja-ekraf-per-provinsi; tangkapan layar 9 Oktober 2026.</w:t>
+      </w:r>
+    </w:p>
+    <w:p>
+      <w:pPr>
+        <w:keepNext/>
+        <w:spacing w:before="120" w:after="40"/>
+        <w:jc w:val="center"/>
+      </w:pPr>
+      <w:r>
+        <w:drawing>
+          <wp:inline xmlns:a="http://schemas.openxmlformats.org/drawingml/2006/main" xmlns:pic="http://schemas.openxmlformats.org/drawingml/2006/picture">
+            <wp:extent cx="5580000" cy="3875000"/>
+            <wp:docPr id="5" name="Picture 5"/>
+            <wp:cNvGraphicFramePr>
+              <a:graphicFrameLocks noChangeAspect="1"/>
+            </wp:cNvGraphicFramePr>
+            <a:graphic>
+              <a:graphicData uri="http://schemas.openxmlformats.org/drawingml/2006/picture">
+                <pic:pic>
+                  <pic:nvPicPr>
+                    <pic:cNvPr id="0" name="16-data-hotel-kamar.jpg"/>
+                    <pic:cNvPicPr/>
+                  </pic:nvPicPr>
+                  <pic:blipFill>
+                    <a:blip r:embed="rId13"/>
+                    <a:stretch>
+                      <a:fillRect/>
+                    </a:stretch>
+                  </pic:blipFill>
+                  <pic:spPr>
+                    <a:xfrm>
+                      <a:off x="0" y="0"/>
+                      <a:ext cx="5580000" cy="3875000"/>
+                    </a:xfrm>
+                    <a:prstGeom prst="rect"/>
+                  </pic:spPr>
+                </pic:pic>
+              </a:graphicData>
+            </a:graphic>
+          </wp:inline>
+        </w:drawing>
+      </w:r>
+    </w:p>
+    <w:p>
+      <w:pPr>
+        <w:spacing w:after="200"/>
+        <w:jc w:val="center"/>
+      </w:pPr>
+      <w:r>
+        <w:rPr>
+          <w:rFonts w:ascii="Arial" w:hAnsi="Arial"/>
+          <w:i/>
+          <w:color w:val="555555"/>
+          <w:sz w:val="18"/>
+        </w:rPr>
+        <w:t>Gambar 5. Dataset hotel dan jumlah kamar hasil penggabungan tiga sumber, dengan kolom status riset dan catatan penggabungan. Sumber: https://dispar.rantai.dev/sdi/hotel-kamar-jakarta; tangkapan layar 9 Oktober 2026.</w:t>
+      </w:r>
+    </w:p>
+    <w:p>
+      <w:pPr>
+        <w:keepNext/>
+        <w:spacing w:before="120" w:after="40"/>
+        <w:jc w:val="center"/>
+      </w:pPr>
+      <w:r>
+        <w:drawing>
+          <wp:inline xmlns:a="http://schemas.openxmlformats.org/drawingml/2006/main" xmlns:pic="http://schemas.openxmlformats.org/drawingml/2006/picture">
+            <wp:extent cx="5580000" cy="3875000"/>
+            <wp:docPr id="6" name="Picture 6"/>
+            <wp:cNvGraphicFramePr>
+              <a:graphicFrameLocks noChangeAspect="1"/>
+            </wp:cNvGraphicFramePr>
+            <a:graphic>
+              <a:graphicData uri="http://schemas.openxmlformats.org/drawingml/2006/picture">
+                <pic:pic>
+                  <pic:nvPicPr>
+                    <pic:cNvPr id="0" name="17-data-hotel-transit.jpg"/>
+                    <pic:cNvPicPr/>
+                  </pic:nvPicPr>
+                  <pic:blipFill>
+                    <a:blip r:embed="rId14"/>
+                    <a:stretch>
+                      <a:fillRect/>
+                    </a:stretch>
+                  </pic:blipFill>
+                  <pic:spPr>
+                    <a:xfrm>
+                      <a:off x="0" y="0"/>
+                      <a:ext cx="5580000" cy="3875000"/>
+                    </a:xfrm>
+                    <a:prstGeom prst="rect"/>
+                  </pic:spPr>
+                </pic:pic>
+              </a:graphicData>
+            </a:graphic>
+          </wp:inline>
+        </w:drawing>
+      </w:r>
+    </w:p>
+    <w:p>
+      <w:pPr>
+        <w:spacing w:after="200"/>
+        <w:jc w:val="center"/>
+      </w:pPr>
+      <w:r>
+        <w:rPr>
+          <w:rFonts w:ascii="Arial" w:hAnsi="Arial"/>
+          <w:i/>
+          <w:color w:val="555555"/>
+          <w:sz w:val="18"/>
+        </w:rPr>
+        <w:t>Gambar 6. Dataset hotel transit dalam radius 5 km dari simpul transportasi, dengan keterangan sumber koordinat. Sumber: https://dispar.rantai.dev/sdi/hotel-transit-jakarta; tangkapan layar 9 Oktober 2026.</w:t>
+      </w:r>
+    </w:p>
+    <w:p>
+      <w:pPr>
+        <w:keepNext/>
+        <w:spacing w:before="120" w:after="40"/>
+        <w:jc w:val="center"/>
+      </w:pPr>
+      <w:r>
+        <w:drawing>
+          <wp:inline xmlns:a="http://schemas.openxmlformats.org/drawingml/2006/main" xmlns:pic="http://schemas.openxmlformats.org/drawingml/2006/picture">
+            <wp:extent cx="5580000" cy="3875000"/>
+            <wp:docPr id="7" name="Picture 7"/>
+            <wp:cNvGraphicFramePr>
+              <a:graphicFrameLocks noChangeAspect="1"/>
+            </wp:cNvGraphicFramePr>
+            <a:graphic>
+              <a:graphicData uri="http://schemas.openxmlformats.org/drawingml/2006/picture">
+                <pic:pic>
+                  <pic:nvPicPr>
+                    <pic:cNvPr id="0" name="18-data-desa-wisata.jpg"/>
+                    <pic:cNvPicPr/>
+                  </pic:nvPicPr>
+                  <pic:blipFill>
+                    <a:blip r:embed="rId15"/>
+                    <a:stretch>
+                      <a:fillRect/>
+                    </a:stretch>
+                  </pic:blipFill>
+                  <pic:spPr>
+                    <a:xfrm>
+                      <a:off x="0" y="0"/>
+                      <a:ext cx="5580000" cy="3875000"/>
+                    </a:xfrm>
+                    <a:prstGeom prst="rect"/>
+                  </pic:spPr>
+                </pic:pic>
+              </a:graphicData>
+            </a:graphic>
+          </wp:inline>
+        </w:drawing>
+      </w:r>
+    </w:p>
+    <w:p>
+      <w:pPr>
+        <w:spacing w:after="200"/>
+        <w:jc w:val="center"/>
+      </w:pPr>
+      <w:r>
+        <w:rPr>
+          <w:rFonts w:ascii="Arial" w:hAnsi="Arial"/>
+          <w:i/>
+          <w:color w:val="555555"/>
+          <w:sz w:val="18"/>
+        </w:rPr>
+        <w:t>Gambar 7. Dataset desa wisata dengan status dan sumber koordinat per baris. Sumber: https://dispar.rantai.dev/sdi/desa-wisata-jakarta; tangkapan layar 9 Oktober 2026.</w:t>
+      </w:r>
+    </w:p>
+    <w:p>
+      <w:pPr>
+        <w:keepNext/>
+        <w:spacing w:before="120" w:after="40"/>
+        <w:jc w:val="center"/>
+      </w:pPr>
+      <w:r>
+        <w:drawing>
+          <wp:inline xmlns:a="http://schemas.openxmlformats.org/drawingml/2006/main" xmlns:pic="http://schemas.openxmlformats.org/drawingml/2006/picture">
+            <wp:extent cx="5580000" cy="3875000"/>
+            <wp:docPr id="8" name="Picture 8"/>
+            <wp:cNvGraphicFramePr>
+              <a:graphicFrameLocks noChangeAspect="1"/>
+            </wp:cNvGraphicFramePr>
+            <a:graphic>
+              <a:graphicData uri="http://schemas.openxmlformats.org/drawingml/2006/picture">
+                <pic:pic>
+                  <pic:nvPicPr>
+                    <pic:cNvPr id="0" name="19-data-wellness.jpg"/>
+                    <pic:cNvPicPr/>
+                  </pic:nvPicPr>
+                  <pic:blipFill>
+                    <a:blip r:embed="rId16"/>
+                    <a:stretch>
+                      <a:fillRect/>
+                    </a:stretch>
+                  </pic:blipFill>
+                  <pic:spPr>
+                    <a:xfrm>
+                      <a:off x="0" y="0"/>
+                      <a:ext cx="5580000" cy="3875000"/>
+                    </a:xfrm>
+                    <a:prstGeom prst="rect"/>
+                  </pic:spPr>
+                </pic:pic>
+              </a:graphicData>
+            </a:graphic>
+          </wp:inline>
+        </w:drawing>
+      </w:r>
+    </w:p>
+    <w:p>
+      <w:pPr>
+        <w:spacing w:after="200"/>
+        <w:jc w:val="center"/>
+      </w:pPr>
+      <w:r>
+        <w:rPr>
+          <w:rFonts w:ascii="Arial" w:hAnsi="Arial"/>
+          <w:i/>
+          <w:color w:val="555555"/>
+          <w:sz w:val="18"/>
+        </w:rPr>
+        <w:t>Gambar 8. Dataset venue wellness dengan keterangan asal dan metode pengumpulan. Sumber: https://dispar.rantai.dev/sdi/wellness-jakarta; tangkapan layar 9 Oktober 2026.</w:t>
       </w:r>
     </w:p>
     <w:p>

</xml_diff>